<commit_message>
Knowledge - 5/19/2026 part 9
</commit_message>
<xml_diff>
--- a/Knowledge/3-Work knowledge/1-Software Engineering/4-Web Development/2-Frontend/2-Core Technologies/1-HTML/5-My Source/3-HTML Body Elements/11-HTML Iframe Element.docx
+++ b/Knowledge/3-Work knowledge/1-Software Engineering/4-Web Development/2-Frontend/2-Core Technologies/1-HTML/5-My Source/3-HTML Body Elements/11-HTML Iframe Element.docx
@@ -2540,7 +2540,6 @@
         <w:t xml:space="preserve">        style="</w:t>
       </w:r>
       <w:proofErr w:type="spellStart"/>
-      <w:proofErr w:type="gramStart"/>
       <w:r>
         <w:rPr>
           <w:rFonts w:ascii="Roboto Mono" w:hAnsi="Roboto Mono"/>
@@ -2548,7 +2547,6 @@
         <w:t>border:none</w:t>
       </w:r>
       <w:proofErr w:type="spellEnd"/>
-      <w:proofErr w:type="gramEnd"/>
       <w:r>
         <w:rPr>
           <w:rFonts w:ascii="Roboto Mono" w:hAnsi="Roboto Mono"/>
@@ -4350,21 +4348,7 @@
         <w:rPr>
           <w:rFonts w:ascii="Roboto Mono" w:hAnsi="Roboto Mono"/>
         </w:rPr>
-        <w:t xml:space="preserve">    </w:t>
-      </w:r>
-      <w:proofErr w:type="gramStart"/>
-      <w:r>
-        <w:rPr>
-          <w:rFonts w:ascii="Roboto Mono" w:hAnsi="Roboto Mono"/>
-        </w:rPr>
-        <w:t>&lt;!--</w:t>
-      </w:r>
-      <w:proofErr w:type="gramEnd"/>
-      <w:r>
-        <w:rPr>
-          <w:rFonts w:ascii="Roboto Mono" w:hAnsi="Roboto Mono"/>
-        </w:rPr>
-        <w:t xml:space="preserve"> Basic </w:t>
+        <w:t xml:space="preserve">    &lt;!-- Basic </w:t>
       </w:r>
       <w:proofErr w:type="spellStart"/>
       <w:r>
@@ -4594,21 +4578,7 @@
         <w:rPr>
           <w:rFonts w:ascii="Roboto Mono" w:hAnsi="Roboto Mono"/>
         </w:rPr>
-        <w:t xml:space="preserve">    </w:t>
-      </w:r>
-      <w:proofErr w:type="gramStart"/>
-      <w:r>
-        <w:rPr>
-          <w:rFonts w:ascii="Roboto Mono" w:hAnsi="Roboto Mono"/>
-        </w:rPr>
-        <w:t>&lt;!--</w:t>
-      </w:r>
-      <w:proofErr w:type="gramEnd"/>
-      <w:r>
-        <w:rPr>
-          <w:rFonts w:ascii="Roboto Mono" w:hAnsi="Roboto Mono"/>
-        </w:rPr>
-        <w:t xml:space="preserve"> Borderless </w:t>
+        <w:t xml:space="preserve">    &lt;!-- Borderless </w:t>
       </w:r>
       <w:proofErr w:type="spellStart"/>
       <w:r>
@@ -4739,7 +4709,6 @@
         <w:t xml:space="preserve">            style="</w:t>
       </w:r>
       <w:proofErr w:type="spellStart"/>
-      <w:proofErr w:type="gramStart"/>
       <w:r>
         <w:rPr>
           <w:rFonts w:ascii="Roboto Mono" w:hAnsi="Roboto Mono"/>
@@ -4747,7 +4716,6 @@
         <w:t>border:none</w:t>
       </w:r>
       <w:proofErr w:type="spellEnd"/>
-      <w:proofErr w:type="gramEnd"/>
       <w:r>
         <w:rPr>
           <w:rFonts w:ascii="Roboto Mono" w:hAnsi="Roboto Mono"/>
@@ -4868,21 +4836,7 @@
         <w:rPr>
           <w:rFonts w:ascii="Roboto Mono" w:hAnsi="Roboto Mono"/>
         </w:rPr>
-        <w:t xml:space="preserve">    </w:t>
-      </w:r>
-      <w:proofErr w:type="gramStart"/>
-      <w:r>
-        <w:rPr>
-          <w:rFonts w:ascii="Roboto Mono" w:hAnsi="Roboto Mono"/>
-        </w:rPr>
-        <w:t>&lt;!--</w:t>
-      </w:r>
-      <w:proofErr w:type="gramEnd"/>
-      <w:r>
-        <w:rPr>
-          <w:rFonts w:ascii="Roboto Mono" w:hAnsi="Roboto Mono"/>
-        </w:rPr>
-        <w:t xml:space="preserve"> YouTube Video --&gt;</w:t>
+        <w:t xml:space="preserve">    &lt;!-- YouTube Video --&gt;</w:t>
       </w:r>
     </w:p>
     <w:p>
@@ -5111,21 +5065,7 @@
         <w:rPr>
           <w:rFonts w:ascii="Roboto Mono" w:hAnsi="Roboto Mono"/>
         </w:rPr>
-        <w:t xml:space="preserve">    </w:t>
-      </w:r>
-      <w:proofErr w:type="gramStart"/>
-      <w:r>
-        <w:rPr>
-          <w:rFonts w:ascii="Roboto Mono" w:hAnsi="Roboto Mono"/>
-        </w:rPr>
-        <w:t>&lt;!--</w:t>
-      </w:r>
-      <w:proofErr w:type="gramEnd"/>
-      <w:r>
-        <w:rPr>
-          <w:rFonts w:ascii="Roboto Mono" w:hAnsi="Roboto Mono"/>
-        </w:rPr>
-        <w:t xml:space="preserve"> Open Links Inside </w:t>
+        <w:t xml:space="preserve">    &lt;!-- Open Links Inside </w:t>
       </w:r>
       <w:proofErr w:type="spellStart"/>
       <w:r>
@@ -6488,21 +6428,7 @@
         <w:rPr>
           <w:rFonts w:ascii="Roboto Mono" w:hAnsi="Roboto Mono"/>
         </w:rPr>
-        <w:t xml:space="preserve">    </w:t>
-      </w:r>
-      <w:proofErr w:type="gramStart"/>
-      <w:r>
-        <w:rPr>
-          <w:rFonts w:ascii="Roboto Mono" w:hAnsi="Roboto Mono"/>
-        </w:rPr>
-        <w:t>&lt;!--</w:t>
-      </w:r>
-      <w:proofErr w:type="gramEnd"/>
-      <w:r>
-        <w:rPr>
-          <w:rFonts w:ascii="Roboto Mono" w:hAnsi="Roboto Mono"/>
-        </w:rPr>
-        <w:t xml:space="preserve"> Basic </w:t>
+        <w:t xml:space="preserve">    &lt;!-- Basic </w:t>
       </w:r>
       <w:proofErr w:type="spellStart"/>
       <w:r>
@@ -6732,21 +6658,7 @@
         <w:rPr>
           <w:rFonts w:ascii="Roboto Mono" w:hAnsi="Roboto Mono"/>
         </w:rPr>
-        <w:t xml:space="preserve">    </w:t>
-      </w:r>
-      <w:proofErr w:type="gramStart"/>
-      <w:r>
-        <w:rPr>
-          <w:rFonts w:ascii="Roboto Mono" w:hAnsi="Roboto Mono"/>
-        </w:rPr>
-        <w:t>&lt;!--</w:t>
-      </w:r>
-      <w:proofErr w:type="gramEnd"/>
-      <w:r>
-        <w:rPr>
-          <w:rFonts w:ascii="Roboto Mono" w:hAnsi="Roboto Mono"/>
-        </w:rPr>
-        <w:t xml:space="preserve"> Borderless </w:t>
+        <w:t xml:space="preserve">    &lt;!-- Borderless </w:t>
       </w:r>
       <w:proofErr w:type="spellStart"/>
       <w:r>
@@ -6877,7 +6789,6 @@
         <w:t>            style="</w:t>
       </w:r>
       <w:proofErr w:type="spellStart"/>
-      <w:proofErr w:type="gramStart"/>
       <w:r>
         <w:rPr>
           <w:rFonts w:ascii="Roboto Mono" w:hAnsi="Roboto Mono"/>
@@ -6885,7 +6796,6 @@
         <w:t>border:none</w:t>
       </w:r>
       <w:proofErr w:type="spellEnd"/>
-      <w:proofErr w:type="gramEnd"/>
       <w:r>
         <w:rPr>
           <w:rFonts w:ascii="Roboto Mono" w:hAnsi="Roboto Mono"/>
@@ -7005,21 +6915,7 @@
         <w:rPr>
           <w:rFonts w:ascii="Roboto Mono" w:hAnsi="Roboto Mono"/>
         </w:rPr>
-        <w:t xml:space="preserve">    </w:t>
-      </w:r>
-      <w:proofErr w:type="gramStart"/>
-      <w:r>
-        <w:rPr>
-          <w:rFonts w:ascii="Roboto Mono" w:hAnsi="Roboto Mono"/>
-        </w:rPr>
-        <w:t>&lt;!--</w:t>
-      </w:r>
-      <w:proofErr w:type="gramEnd"/>
-      <w:r>
-        <w:rPr>
-          <w:rFonts w:ascii="Roboto Mono" w:hAnsi="Roboto Mono"/>
-        </w:rPr>
-        <w:t xml:space="preserve"> YouTube Video --&gt;</w:t>
+        <w:t>    &lt;!-- YouTube Video --&gt;</w:t>
       </w:r>
     </w:p>
     <w:p>
@@ -7248,21 +7144,7 @@
         <w:rPr>
           <w:rFonts w:ascii="Roboto Mono" w:hAnsi="Roboto Mono"/>
         </w:rPr>
-        <w:t xml:space="preserve">    </w:t>
-      </w:r>
-      <w:proofErr w:type="gramStart"/>
-      <w:r>
-        <w:rPr>
-          <w:rFonts w:ascii="Roboto Mono" w:hAnsi="Roboto Mono"/>
-        </w:rPr>
-        <w:t>&lt;!--</w:t>
-      </w:r>
-      <w:proofErr w:type="gramEnd"/>
-      <w:r>
-        <w:rPr>
-          <w:rFonts w:ascii="Roboto Mono" w:hAnsi="Roboto Mono"/>
-        </w:rPr>
-        <w:t xml:space="preserve"> Open Links Inside </w:t>
+        <w:t xml:space="preserve">    &lt;!-- Open Links Inside </w:t>
       </w:r>
       <w:proofErr w:type="spellStart"/>
       <w:r>
@@ -7637,11 +7519,194 @@
           <w:rFonts w:ascii="Roboto Mono" w:hAnsi="Roboto Mono"/>
         </w:rPr>
       </w:pPr>
+    </w:p>
+    <w:p>
+      <w:pPr>
+        <w:rPr>
+          <w:rFonts w:ascii="Roboto Mono" w:hAnsi="Roboto Mono"/>
+        </w:rPr>
+      </w:pPr>
+    </w:p>
+    <w:p>
+      <w:pPr>
+        <w:rPr>
+          <w:rFonts w:ascii="Roboto Mono" w:hAnsi="Roboto Mono"/>
+        </w:rPr>
+      </w:pPr>
+    </w:p>
+    <w:p>
+      <w:pPr>
+        <w:rPr>
+          <w:rFonts w:ascii="Roboto Mono" w:hAnsi="Roboto Mono"/>
+        </w:rPr>
+      </w:pPr>
+    </w:p>
+    <w:p>
+      <w:pPr>
+        <w:rPr>
+          <w:rFonts w:ascii="Roboto Mono" w:hAnsi="Roboto Mono"/>
+        </w:rPr>
+      </w:pPr>
+      <w:r>
+        <w:rPr>
+          <w:rFonts w:ascii="Arial" w:hAnsi="Arial"/>
+          <w:b/>
+          <w:sz w:val="18"/>
+          <w:highlight w:val="lightGray"/>
+        </w:rPr>
+        <w:lastRenderedPageBreak/>
+        <w:t># Source: GIF</w:t>
+      </w:r>
+      <w:r>
+        <w:rPr>
+          <w:rFonts w:ascii="Arial" w:hAnsi="Arial"/>
+          <w:sz w:val="18"/>
+          <w:highlight w:val="lightGray"/>
+        </w:rPr>
+        <w:t xml:space="preserve"> </w:t>
+      </w:r>
+      <w:r>
+        <w:rPr>
+          <w:rFonts w:ascii="Arial" w:hAnsi="Arial"/>
+          <w:b/>
+          <w:sz w:val="18"/>
+          <w:highlight w:val="lightGray"/>
+        </w:rPr>
+        <w:t>Source</w:t>
+      </w:r>
+      <w:r>
+        <w:rPr>
+          <w:rFonts w:ascii="Arial" w:hAnsi="Arial"/>
+          <w:sz w:val="18"/>
+          <w:highlight w:val="lightGray"/>
+        </w:rPr>
+        <w:t xml:space="preserve">: </w:t>
+      </w:r>
+      <w:r>
+        <w:rPr>
+          <w:rFonts w:ascii="Arial" w:hAnsi="Arial"/>
+          <w:b/>
+          <w:sz w:val="18"/>
+          <w:highlight w:val="lightGray"/>
+        </w:rPr>
+        <w:t>Provided by:</w:t>
+      </w:r>
+      <w:r>
+        <w:rPr>
+          <w:rFonts w:ascii="Arial" w:hAnsi="Arial"/>
+          <w:sz w:val="18"/>
+          <w:highlight w:val="lightGray"/>
+        </w:rPr>
+        <w:t xml:space="preserve"> [Persons Table -&gt; ID Column: 1, </w:t>
+      </w:r>
+      <w:proofErr w:type="spellStart"/>
+      <w:r>
+        <w:rPr>
+          <w:rFonts w:ascii="Arial" w:hAnsi="Arial"/>
+          <w:sz w:val="18"/>
+          <w:highlight w:val="lightGray"/>
+        </w:rPr>
+        <w:t>Name_En</w:t>
+      </w:r>
+      <w:proofErr w:type="spellEnd"/>
+      <w:r>
+        <w:rPr>
+          <w:rFonts w:ascii="Arial" w:hAnsi="Arial"/>
+          <w:sz w:val="18"/>
+          <w:highlight w:val="lightGray"/>
+        </w:rPr>
+        <w:t xml:space="preserve"> Column: Motasem Essam] -&gt; </w:t>
+      </w:r>
+      <w:r>
+        <w:rPr>
+          <w:rFonts w:ascii="Arial" w:hAnsi="Arial"/>
+          <w:b/>
+          <w:sz w:val="18"/>
+          <w:highlight w:val="lightGray"/>
+        </w:rPr>
+        <w:t>Tool:</w:t>
+      </w:r>
+      <w:r>
+        <w:rPr>
+          <w:rFonts w:ascii="Arial" w:hAnsi="Arial"/>
+          <w:sz w:val="18"/>
+          <w:highlight w:val="lightGray"/>
+        </w:rPr>
+        <w:t xml:space="preserve"> [Automation Table -&gt; ID Column: 17, </w:t>
+      </w:r>
+      <w:proofErr w:type="spellStart"/>
+      <w:r>
+        <w:rPr>
+          <w:rFonts w:ascii="Arial" w:hAnsi="Arial"/>
+          <w:sz w:val="18"/>
+          <w:highlight w:val="lightGray"/>
+        </w:rPr>
+        <w:t>Name_En</w:t>
+      </w:r>
+      <w:proofErr w:type="spellEnd"/>
+      <w:r>
+        <w:rPr>
+          <w:rFonts w:ascii="Arial" w:hAnsi="Arial"/>
+          <w:sz w:val="18"/>
+          <w:highlight w:val="lightGray"/>
+        </w:rPr>
+        <w:t xml:space="preserve"> Column: GIF Recorder] -&gt; </w:t>
+      </w:r>
+      <w:r>
+        <w:rPr>
+          <w:rFonts w:ascii="Arial" w:eastAsia="Arial" w:hAnsi="Arial" w:cs="Arial"/>
+          <w:b/>
+          <w:color w:val="000000"/>
+          <w:sz w:val="18"/>
+          <w:highlight w:val="lightGray"/>
+        </w:rPr>
+        <w:t xml:space="preserve">From </w:t>
+      </w:r>
+      <w:r>
+        <w:rPr>
+          <w:rFonts w:ascii="Arial" w:eastAsia="Arial" w:hAnsi="Arial" w:cs="Arial"/>
+          <w:color w:val="000000"/>
+          <w:sz w:val="18"/>
+          <w:highlight w:val="lightGray"/>
+        </w:rPr>
+        <w:t>[Operating System: Windows]</w:t>
+      </w:r>
+      <w:r>
+        <w:rPr>
+          <w:rFonts w:ascii="Arial" w:hAnsi="Arial"/>
+          <w:sz w:val="18"/>
+          <w:highlight w:val="lightGray"/>
+        </w:rPr>
+        <w:t xml:space="preserve"> </w:t>
+      </w:r>
+      <w:r>
+        <w:rPr>
+          <w:rFonts w:ascii="Arial" w:hAnsi="Arial"/>
+          <w:b/>
+          <w:sz w:val="18"/>
+          <w:highlight w:val="lightGray"/>
+        </w:rPr>
+        <w:t>on</w:t>
+      </w:r>
+      <w:r>
+        <w:rPr>
+          <w:rFonts w:ascii="Arial" w:hAnsi="Arial"/>
+          <w:sz w:val="18"/>
+          <w:highlight w:val="lightGray"/>
+        </w:rPr>
+        <w:t xml:space="preserve"> [5/6/2026]</w:t>
+      </w:r>
+    </w:p>
+    <w:p>
+      <w:pPr>
+        <w:rPr>
+          <w:rFonts w:ascii="Roboto Mono" w:hAnsi="Roboto Mono"/>
+        </w:rPr>
+      </w:pPr>
       <w:r>
         <w:rPr>
           <w:noProof/>
         </w:rPr>
-        <w:lastRenderedPageBreak/>
         <w:drawing>
           <wp:inline distT="0" distB="0" distL="0" distR="0" wp14:anchorId="61F639A5" wp14:editId="11861C16">
             <wp:extent cx="5943600" cy="3343275"/>
@@ -8313,7 +8378,6 @@
               </w:rPr>
             </w:pPr>
             <w:proofErr w:type="spellStart"/>
-            <w:proofErr w:type="gramStart"/>
             <w:r>
               <w:rPr>
                 <w:rFonts w:ascii="Roboto Mono" w:hAnsi="Roboto Mono"/>
@@ -8321,7 +8385,6 @@
               <w:t>border:none</w:t>
             </w:r>
             <w:proofErr w:type="spellEnd"/>
-            <w:proofErr w:type="gramEnd"/>
           </w:p>
         </w:tc>
         <w:tc>

</xml_diff>